<commit_message>
ajout Gitlab exos et cours
</commit_message>
<xml_diff>
--- a/AWS-Amazone_web_services/AWS_COURS/Cours_EC2_v2.docx
+++ b/AWS-Amazone_web_services/AWS_COURS/Cours_EC2_v2.docx
@@ -2,6 +2,11 @@
 <file path=word/document.xml><?xml version="1.0" encoding="utf-8"?>
 <w:document xmlns:wpc="http://schemas.microsoft.com/office/word/2010/wordprocessingCanvas" xmlns:cx="http://schemas.microsoft.com/office/drawing/2014/chartex" xmlns:cx1="http://schemas.microsoft.com/office/drawing/2015/9/8/chartex" xmlns:cx2="http://schemas.microsoft.com/office/drawing/2015/10/21/chartex" xmlns:cx3="http://schemas.microsoft.com/office/drawing/2016/5/9/chartex" xmlns:cx4="http://schemas.microsoft.com/office/drawing/2016/5/10/chartex" xmlns:cx5="http://schemas.microsoft.com/office/drawing/2016/5/11/chartex" xmlns:cx6="http://schemas.microsoft.com/office/drawing/2016/5/12/chartex" xmlns:cx7="http://schemas.microsoft.com/office/drawing/2016/5/13/chartex" xmlns:cx8="http://schemas.microsoft.com/office/drawing/2016/5/14/chartex" xmlns:mc="http://schemas.openxmlformats.org/markup-compatibility/2006" xmlns:aink="http://schemas.microsoft.com/office/drawing/2016/ink" xmlns:am3d="http://schemas.microsoft.com/office/drawing/2017/model3d" xmlns:o="urn:schemas-microsoft-com:office:office" xmlns:oel="http://schemas.microsoft.com/office/2019/extlst" xmlns:r="http://schemas.openxmlformats.org/officeDocument/2006/relationships" xmlns:m="http://schemas.openxmlformats.org/officeDocument/2006/math" xmlns:v="urn:schemas-microsoft-com:vml" xmlns:wp14="http://schemas.microsoft.com/office/word/2010/wordprocessingDrawing" xmlns:wp="http://schemas.openxmlformats.org/drawingml/2006/wordprocessingDrawing" xmlns:w10="urn:schemas-microsoft-com:office:word" xmlns:w="http://schemas.openxmlformats.org/wordprocessingml/2006/main" xmlns:w14="http://schemas.microsoft.com/office/word/2010/wordml" xmlns:w15="http://schemas.microsoft.com/office/word/2012/wordml" xmlns:w16cex="http://schemas.microsoft.com/office/word/2018/wordml/cex" xmlns:w16cid="http://schemas.microsoft.com/office/word/2016/wordml/cid" xmlns:w16="http://schemas.microsoft.com/office/word/2018/wordml" xmlns:w16sdtdh="http://schemas.microsoft.com/office/word/2020/wordml/sdtdatahash" xmlns:w16se="http://schemas.microsoft.com/office/word/2015/wordml/symex" xmlns:wpg="http://schemas.microsoft.com/office/word/2010/wordprocessingGroup" xmlns:wpi="http://schemas.microsoft.com/office/word/2010/wordprocessingInk" xmlns:wne="http://schemas.microsoft.com/office/word/2006/wordml" xmlns:wps="http://schemas.microsoft.com/office/word/2010/wordprocessingShape" mc:Ignorable="w14 w15 w16se w16cid w16 w16cex w16sdtdh wp14">
   <w:body>
+    <w:p>
+      <w:pPr>
+        <w:spacing w:before="2400"/>
+      </w:pPr>
+    </w:p>
     <w:p>
       <w:pPr>
         <w:spacing w:before="2400"/>
@@ -191,12 +196,6 @@
         <w:gridCol w:w="6038"/>
       </w:tblGrid>
       <w:tr>
-        <w:tblPrEx>
-          <w:tblCellMar>
-            <w:top w:w="0" w:type="dxa"/>
-            <w:bottom w:w="0" w:type="dxa"/>
-          </w:tblCellMar>
-        </w:tblPrEx>
         <w:trPr>
           <w:tblHeader/>
         </w:trPr>
@@ -264,12 +263,6 @@
         </w:tc>
       </w:tr>
       <w:tr>
-        <w:tblPrEx>
-          <w:tblCellMar>
-            <w:top w:w="0" w:type="dxa"/>
-            <w:bottom w:w="0" w:type="dxa"/>
-          </w:tblCellMar>
-        </w:tblPrEx>
         <w:tc>
           <w:tcPr>
             <w:tcW w:w="3600" w:type="dxa"/>
@@ -324,12 +317,6 @@
         </w:tc>
       </w:tr>
       <w:tr>
-        <w:tblPrEx>
-          <w:tblCellMar>
-            <w:top w:w="0" w:type="dxa"/>
-            <w:bottom w:w="0" w:type="dxa"/>
-          </w:tblCellMar>
-        </w:tblPrEx>
         <w:tc>
           <w:tcPr>
             <w:tcW w:w="3600" w:type="dxa"/>
@@ -384,12 +371,6 @@
         </w:tc>
       </w:tr>
       <w:tr>
-        <w:tblPrEx>
-          <w:tblCellMar>
-            <w:top w:w="0" w:type="dxa"/>
-            <w:bottom w:w="0" w:type="dxa"/>
-          </w:tblCellMar>
-        </w:tblPrEx>
         <w:tc>
           <w:tcPr>
             <w:tcW w:w="3600" w:type="dxa"/>
@@ -444,12 +425,6 @@
         </w:tc>
       </w:tr>
       <w:tr>
-        <w:tblPrEx>
-          <w:tblCellMar>
-            <w:top w:w="0" w:type="dxa"/>
-            <w:bottom w:w="0" w:type="dxa"/>
-          </w:tblCellMar>
-        </w:tblPrEx>
         <w:tc>
           <w:tcPr>
             <w:tcW w:w="3600" w:type="dxa"/>
@@ -504,12 +479,6 @@
         </w:tc>
       </w:tr>
       <w:tr>
-        <w:tblPrEx>
-          <w:tblCellMar>
-            <w:top w:w="0" w:type="dxa"/>
-            <w:bottom w:w="0" w:type="dxa"/>
-          </w:tblCellMar>
-        </w:tblPrEx>
         <w:tc>
           <w:tcPr>
             <w:tcW w:w="3600" w:type="dxa"/>
@@ -564,12 +533,6 @@
         </w:tc>
       </w:tr>
       <w:tr>
-        <w:tblPrEx>
-          <w:tblCellMar>
-            <w:top w:w="0" w:type="dxa"/>
-            <w:bottom w:w="0" w:type="dxa"/>
-          </w:tblCellMar>
-        </w:tblPrEx>
         <w:tc>
           <w:tcPr>
             <w:tcW w:w="3600" w:type="dxa"/>
@@ -624,12 +587,6 @@
         </w:tc>
       </w:tr>
       <w:tr>
-        <w:tblPrEx>
-          <w:tblCellMar>
-            <w:top w:w="0" w:type="dxa"/>
-            <w:bottom w:w="0" w:type="dxa"/>
-          </w:tblCellMar>
-        </w:tblPrEx>
         <w:tc>
           <w:tcPr>
             <w:tcW w:w="3600" w:type="dxa"/>
@@ -684,12 +641,6 @@
         </w:tc>
       </w:tr>
       <w:tr>
-        <w:tblPrEx>
-          <w:tblCellMar>
-            <w:top w:w="0" w:type="dxa"/>
-            <w:bottom w:w="0" w:type="dxa"/>
-          </w:tblCellMar>
-        </w:tblPrEx>
         <w:tc>
           <w:tcPr>
             <w:tcW w:w="3600" w:type="dxa"/>
@@ -744,12 +695,6 @@
         </w:tc>
       </w:tr>
       <w:tr>
-        <w:tblPrEx>
-          <w:tblCellMar>
-            <w:top w:w="0" w:type="dxa"/>
-            <w:bottom w:w="0" w:type="dxa"/>
-          </w:tblCellMar>
-        </w:tblPrEx>
         <w:tc>
           <w:tcPr>
             <w:tcW w:w="3600" w:type="dxa"/>
@@ -830,12 +775,6 @@
         <w:gridCol w:w="9638"/>
       </w:tblGrid>
       <w:tr>
-        <w:tblPrEx>
-          <w:tblCellMar>
-            <w:top w:w="0" w:type="dxa"/>
-            <w:bottom w:w="0" w:type="dxa"/>
-          </w:tblCellMar>
-        </w:tblPrEx>
         <w:trPr>
           <w:cantSplit/>
         </w:trPr>
@@ -3299,12 +3238,6 @@
         <w:gridCol w:w="9638"/>
       </w:tblGrid>
       <w:tr>
-        <w:tblPrEx>
-          <w:tblCellMar>
-            <w:top w:w="0" w:type="dxa"/>
-            <w:bottom w:w="0" w:type="dxa"/>
-          </w:tblCellMar>
-        </w:tblPrEx>
         <w:trPr>
           <w:cantSplit/>
         </w:trPr>
@@ -3436,12 +3369,6 @@
         <w:gridCol w:w="9638"/>
       </w:tblGrid>
       <w:tr>
-        <w:tblPrEx>
-          <w:tblCellMar>
-            <w:top w:w="0" w:type="dxa"/>
-            <w:bottom w:w="0" w:type="dxa"/>
-          </w:tblCellMar>
-        </w:tblPrEx>
         <w:trPr>
           <w:cantSplit/>
         </w:trPr>
@@ -3514,12 +3441,6 @@
         <w:gridCol w:w="9638"/>
       </w:tblGrid>
       <w:tr>
-        <w:tblPrEx>
-          <w:tblCellMar>
-            <w:top w:w="0" w:type="dxa"/>
-            <w:bottom w:w="0" w:type="dxa"/>
-          </w:tblCellMar>
-        </w:tblPrEx>
         <w:trPr>
           <w:cantSplit/>
         </w:trPr>
@@ -3667,12 +3588,6 @@
         <w:gridCol w:w="3838"/>
       </w:tblGrid>
       <w:tr>
-        <w:tblPrEx>
-          <w:tblCellMar>
-            <w:top w:w="0" w:type="dxa"/>
-            <w:bottom w:w="0" w:type="dxa"/>
-          </w:tblCellMar>
-        </w:tblPrEx>
         <w:trPr>
           <w:tblHeader/>
         </w:trPr>
@@ -3771,12 +3686,6 @@
         </w:tc>
       </w:tr>
       <w:tr>
-        <w:tblPrEx>
-          <w:tblCellMar>
-            <w:top w:w="0" w:type="dxa"/>
-            <w:bottom w:w="0" w:type="dxa"/>
-          </w:tblCellMar>
-        </w:tblPrEx>
         <w:tc>
           <w:tcPr>
             <w:tcW w:w="2200" w:type="dxa"/>
@@ -3861,12 +3770,6 @@
         </w:tc>
       </w:tr>
       <w:tr>
-        <w:tblPrEx>
-          <w:tblCellMar>
-            <w:top w:w="0" w:type="dxa"/>
-            <w:bottom w:w="0" w:type="dxa"/>
-          </w:tblCellMar>
-        </w:tblPrEx>
         <w:tc>
           <w:tcPr>
             <w:tcW w:w="2200" w:type="dxa"/>
@@ -3951,12 +3854,6 @@
         </w:tc>
       </w:tr>
       <w:tr>
-        <w:tblPrEx>
-          <w:tblCellMar>
-            <w:top w:w="0" w:type="dxa"/>
-            <w:bottom w:w="0" w:type="dxa"/>
-          </w:tblCellMar>
-        </w:tblPrEx>
         <w:tc>
           <w:tcPr>
             <w:tcW w:w="2200" w:type="dxa"/>
@@ -4148,12 +4045,6 @@
         <w:gridCol w:w="9638"/>
       </w:tblGrid>
       <w:tr>
-        <w:tblPrEx>
-          <w:tblCellMar>
-            <w:top w:w="0" w:type="dxa"/>
-            <w:bottom w:w="0" w:type="dxa"/>
-          </w:tblCellMar>
-        </w:tblPrEx>
         <w:trPr>
           <w:cantSplit/>
         </w:trPr>
@@ -4289,12 +4180,6 @@
         <w:gridCol w:w="9638"/>
       </w:tblGrid>
       <w:tr>
-        <w:tblPrEx>
-          <w:tblCellMar>
-            <w:top w:w="0" w:type="dxa"/>
-            <w:bottom w:w="0" w:type="dxa"/>
-          </w:tblCellMar>
-        </w:tblPrEx>
         <w:trPr>
           <w:cantSplit/>
         </w:trPr>
@@ -4440,12 +4325,6 @@
         <w:gridCol w:w="9638"/>
       </w:tblGrid>
       <w:tr>
-        <w:tblPrEx>
-          <w:tblCellMar>
-            <w:top w:w="0" w:type="dxa"/>
-            <w:bottom w:w="0" w:type="dxa"/>
-          </w:tblCellMar>
-        </w:tblPrEx>
         <w:trPr>
           <w:cantSplit/>
         </w:trPr>
@@ -4548,12 +4427,6 @@
         <w:gridCol w:w="9638"/>
       </w:tblGrid>
       <w:tr>
-        <w:tblPrEx>
-          <w:tblCellMar>
-            <w:top w:w="0" w:type="dxa"/>
-            <w:bottom w:w="0" w:type="dxa"/>
-          </w:tblCellMar>
-        </w:tblPrEx>
         <w:trPr>
           <w:cantSplit/>
         </w:trPr>
@@ -4695,12 +4568,6 @@
         <w:gridCol w:w="9638"/>
       </w:tblGrid>
       <w:tr>
-        <w:tblPrEx>
-          <w:tblCellMar>
-            <w:top w:w="0" w:type="dxa"/>
-            <w:bottom w:w="0" w:type="dxa"/>
-          </w:tblCellMar>
-        </w:tblPrEx>
         <w:trPr>
           <w:cantSplit/>
         </w:trPr>
@@ -4811,12 +4678,6 @@
         <w:gridCol w:w="9638"/>
       </w:tblGrid>
       <w:tr>
-        <w:tblPrEx>
-          <w:tblCellMar>
-            <w:top w:w="0" w:type="dxa"/>
-            <w:bottom w:w="0" w:type="dxa"/>
-          </w:tblCellMar>
-        </w:tblPrEx>
         <w:trPr>
           <w:cantSplit/>
         </w:trPr>
@@ -4931,12 +4792,6 @@
         <w:gridCol w:w="9638"/>
       </w:tblGrid>
       <w:tr>
-        <w:tblPrEx>
-          <w:tblCellMar>
-            <w:top w:w="0" w:type="dxa"/>
-            <w:bottom w:w="0" w:type="dxa"/>
-          </w:tblCellMar>
-        </w:tblPrEx>
         <w:trPr>
           <w:cantSplit/>
         </w:trPr>
@@ -5070,12 +4925,6 @@
         <w:gridCol w:w="9638"/>
       </w:tblGrid>
       <w:tr>
-        <w:tblPrEx>
-          <w:tblCellMar>
-            <w:top w:w="0" w:type="dxa"/>
-            <w:bottom w:w="0" w:type="dxa"/>
-          </w:tblCellMar>
-        </w:tblPrEx>
         <w:trPr>
           <w:cantSplit/>
         </w:trPr>
@@ -5390,12 +5239,6 @@
         <w:gridCol w:w="6038"/>
       </w:tblGrid>
       <w:tr>
-        <w:tblPrEx>
-          <w:tblCellMar>
-            <w:top w:w="0" w:type="dxa"/>
-            <w:bottom w:w="0" w:type="dxa"/>
-          </w:tblCellMar>
-        </w:tblPrEx>
         <w:trPr>
           <w:tblHeader/>
         </w:trPr>
@@ -5463,12 +5306,6 @@
         </w:tc>
       </w:tr>
       <w:tr>
-        <w:tblPrEx>
-          <w:tblCellMar>
-            <w:top w:w="0" w:type="dxa"/>
-            <w:bottom w:w="0" w:type="dxa"/>
-          </w:tblCellMar>
-        </w:tblPrEx>
         <w:tc>
           <w:tcPr>
             <w:tcW w:w="3600" w:type="dxa"/>
@@ -5529,12 +5366,6 @@
         </w:tc>
       </w:tr>
       <w:tr>
-        <w:tblPrEx>
-          <w:tblCellMar>
-            <w:top w:w="0" w:type="dxa"/>
-            <w:bottom w:w="0" w:type="dxa"/>
-          </w:tblCellMar>
-        </w:tblPrEx>
         <w:tc>
           <w:tcPr>
             <w:tcW w:w="3600" w:type="dxa"/>
@@ -5606,12 +5437,6 @@
         </w:tc>
       </w:tr>
       <w:tr>
-        <w:tblPrEx>
-          <w:tblCellMar>
-            <w:top w:w="0" w:type="dxa"/>
-            <w:bottom w:w="0" w:type="dxa"/>
-          </w:tblCellMar>
-        </w:tblPrEx>
         <w:tc>
           <w:tcPr>
             <w:tcW w:w="3600" w:type="dxa"/>
@@ -5674,12 +5499,6 @@
         </w:tc>
       </w:tr>
       <w:tr>
-        <w:tblPrEx>
-          <w:tblCellMar>
-            <w:top w:w="0" w:type="dxa"/>
-            <w:bottom w:w="0" w:type="dxa"/>
-          </w:tblCellMar>
-        </w:tblPrEx>
         <w:tc>
           <w:tcPr>
             <w:tcW w:w="3600" w:type="dxa"/>
@@ -5740,12 +5559,6 @@
         </w:tc>
       </w:tr>
       <w:tr>
-        <w:tblPrEx>
-          <w:tblCellMar>
-            <w:top w:w="0" w:type="dxa"/>
-            <w:bottom w:w="0" w:type="dxa"/>
-          </w:tblCellMar>
-        </w:tblPrEx>
         <w:tc>
           <w:tcPr>
             <w:tcW w:w="3600" w:type="dxa"/>
@@ -5844,12 +5657,6 @@
         <w:gridCol w:w="6038"/>
       </w:tblGrid>
       <w:tr>
-        <w:tblPrEx>
-          <w:tblCellMar>
-            <w:top w:w="0" w:type="dxa"/>
-            <w:bottom w:w="0" w:type="dxa"/>
-          </w:tblCellMar>
-        </w:tblPrEx>
         <w:trPr>
           <w:tblHeader/>
         </w:trPr>
@@ -5917,12 +5724,6 @@
         </w:tc>
       </w:tr>
       <w:tr>
-        <w:tblPrEx>
-          <w:tblCellMar>
-            <w:top w:w="0" w:type="dxa"/>
-            <w:bottom w:w="0" w:type="dxa"/>
-          </w:tblCellMar>
-        </w:tblPrEx>
         <w:tc>
           <w:tcPr>
             <w:tcW w:w="3600" w:type="dxa"/>
@@ -6012,12 +5813,6 @@
         </w:tc>
       </w:tr>
       <w:tr>
-        <w:tblPrEx>
-          <w:tblCellMar>
-            <w:top w:w="0" w:type="dxa"/>
-            <w:bottom w:w="0" w:type="dxa"/>
-          </w:tblCellMar>
-        </w:tblPrEx>
         <w:tc>
           <w:tcPr>
             <w:tcW w:w="3600" w:type="dxa"/>
@@ -6098,12 +5893,6 @@
         </w:tc>
       </w:tr>
       <w:tr>
-        <w:tblPrEx>
-          <w:tblCellMar>
-            <w:top w:w="0" w:type="dxa"/>
-            <w:bottom w:w="0" w:type="dxa"/>
-          </w:tblCellMar>
-        </w:tblPrEx>
         <w:tc>
           <w:tcPr>
             <w:tcW w:w="3600" w:type="dxa"/>
@@ -6215,12 +6004,6 @@
         </w:tc>
       </w:tr>
       <w:tr>
-        <w:tblPrEx>
-          <w:tblCellMar>
-            <w:top w:w="0" w:type="dxa"/>
-            <w:bottom w:w="0" w:type="dxa"/>
-          </w:tblCellMar>
-        </w:tblPrEx>
         <w:tc>
           <w:tcPr>
             <w:tcW w:w="3600" w:type="dxa"/>
@@ -6318,12 +6101,6 @@
         <w:gridCol w:w="9638"/>
       </w:tblGrid>
       <w:tr>
-        <w:tblPrEx>
-          <w:tblCellMar>
-            <w:top w:w="0" w:type="dxa"/>
-            <w:bottom w:w="0" w:type="dxa"/>
-          </w:tblCellMar>
-        </w:tblPrEx>
         <w:trPr>
           <w:cantSplit/>
         </w:trPr>
@@ -6425,12 +6202,6 @@
         <w:gridCol w:w="9638"/>
       </w:tblGrid>
       <w:tr>
-        <w:tblPrEx>
-          <w:tblCellMar>
-            <w:top w:w="0" w:type="dxa"/>
-            <w:bottom w:w="0" w:type="dxa"/>
-          </w:tblCellMar>
-        </w:tblPrEx>
         <w:trPr>
           <w:cantSplit/>
         </w:trPr>
@@ -6604,12 +6375,6 @@
         <w:gridCol w:w="4638"/>
       </w:tblGrid>
       <w:tr>
-        <w:tblPrEx>
-          <w:tblCellMar>
-            <w:top w:w="0" w:type="dxa"/>
-            <w:bottom w:w="0" w:type="dxa"/>
-          </w:tblCellMar>
-        </w:tblPrEx>
         <w:trPr>
           <w:tblHeader/>
         </w:trPr>
@@ -6741,12 +6506,6 @@
         </w:tc>
       </w:tr>
       <w:tr>
-        <w:tblPrEx>
-          <w:tblCellMar>
-            <w:top w:w="0" w:type="dxa"/>
-            <w:bottom w:w="0" w:type="dxa"/>
-          </w:tblCellMar>
-        </w:tblPrEx>
         <w:tc>
           <w:tcPr>
             <w:tcW w:w="1800" w:type="dxa"/>
@@ -6880,12 +6639,6 @@
         </w:tc>
       </w:tr>
       <w:tr>
-        <w:tblPrEx>
-          <w:tblCellMar>
-            <w:top w:w="0" w:type="dxa"/>
-            <w:bottom w:w="0" w:type="dxa"/>
-          </w:tblCellMar>
-        </w:tblPrEx>
         <w:tc>
           <w:tcPr>
             <w:tcW w:w="1800" w:type="dxa"/>
@@ -7040,12 +6793,6 @@
         <w:gridCol w:w="9638"/>
       </w:tblGrid>
       <w:tr>
-        <w:tblPrEx>
-          <w:tblCellMar>
-            <w:top w:w="0" w:type="dxa"/>
-            <w:bottom w:w="0" w:type="dxa"/>
-          </w:tblCellMar>
-        </w:tblPrEx>
         <w:trPr>
           <w:cantSplit/>
         </w:trPr>
@@ -7171,12 +6918,6 @@
         <w:gridCol w:w="2600"/>
       </w:tblGrid>
       <w:tr>
-        <w:tblPrEx>
-          <w:tblCellMar>
-            <w:top w:w="0" w:type="dxa"/>
-            <w:bottom w:w="0" w:type="dxa"/>
-          </w:tblCellMar>
-        </w:tblPrEx>
         <w:trPr>
           <w:tblHeader/>
         </w:trPr>
@@ -7306,12 +7047,6 @@
         </w:tc>
       </w:tr>
       <w:tr>
-        <w:tblPrEx>
-          <w:tblCellMar>
-            <w:top w:w="0" w:type="dxa"/>
-            <w:bottom w:w="0" w:type="dxa"/>
-          </w:tblCellMar>
-        </w:tblPrEx>
         <w:tc>
           <w:tcPr>
             <w:tcW w:w="1100" w:type="dxa"/>
@@ -7435,12 +7170,6 @@
         </w:tc>
       </w:tr>
       <w:tr>
-        <w:tblPrEx>
-          <w:tblCellMar>
-            <w:top w:w="0" w:type="dxa"/>
-            <w:bottom w:w="0" w:type="dxa"/>
-          </w:tblCellMar>
-        </w:tblPrEx>
         <w:tc>
           <w:tcPr>
             <w:tcW w:w="1100" w:type="dxa"/>
@@ -7583,12 +7312,6 @@
         </w:tc>
       </w:tr>
       <w:tr>
-        <w:tblPrEx>
-          <w:tblCellMar>
-            <w:top w:w="0" w:type="dxa"/>
-            <w:bottom w:w="0" w:type="dxa"/>
-          </w:tblCellMar>
-        </w:tblPrEx>
         <w:tc>
           <w:tcPr>
             <w:tcW w:w="1100" w:type="dxa"/>
@@ -7723,12 +7446,6 @@
         </w:tc>
       </w:tr>
       <w:tr>
-        <w:tblPrEx>
-          <w:tblCellMar>
-            <w:top w:w="0" w:type="dxa"/>
-            <w:bottom w:w="0" w:type="dxa"/>
-          </w:tblCellMar>
-        </w:tblPrEx>
         <w:tc>
           <w:tcPr>
             <w:tcW w:w="1100" w:type="dxa"/>
@@ -7863,12 +7580,6 @@
         </w:tc>
       </w:tr>
       <w:tr>
-        <w:tblPrEx>
-          <w:tblCellMar>
-            <w:top w:w="0" w:type="dxa"/>
-            <w:bottom w:w="0" w:type="dxa"/>
-          </w:tblCellMar>
-        </w:tblPrEx>
         <w:tc>
           <w:tcPr>
             <w:tcW w:w="1100" w:type="dxa"/>
@@ -8014,12 +7725,6 @@
         <w:gridCol w:w="9638"/>
       </w:tblGrid>
       <w:tr>
-        <w:tblPrEx>
-          <w:tblCellMar>
-            <w:top w:w="0" w:type="dxa"/>
-            <w:bottom w:w="0" w:type="dxa"/>
-          </w:tblCellMar>
-        </w:tblPrEx>
         <w:trPr>
           <w:cantSplit/>
         </w:trPr>
@@ -8267,12 +7972,6 @@
         <w:gridCol w:w="9638"/>
       </w:tblGrid>
       <w:tr>
-        <w:tblPrEx>
-          <w:tblCellMar>
-            <w:top w:w="0" w:type="dxa"/>
-            <w:bottom w:w="0" w:type="dxa"/>
-          </w:tblCellMar>
-        </w:tblPrEx>
         <w:trPr>
           <w:cantSplit/>
         </w:trPr>
@@ -8339,6 +8038,11 @@
         <w:pStyle w:val="Titre2"/>
       </w:pPr>
       <w:bookmarkStart w:id="10" w:name="_Toc240453447"/>
+    </w:p>
+    <w:p>
+      <w:pPr>
+        <w:pStyle w:val="Titre2"/>
+      </w:pPr>
       <w:r>
         <w:t>2.3 Le free-tier EC2 : 750 heures par mois</w:t>
       </w:r>
@@ -8365,12 +8069,6 @@
         <w:gridCol w:w="9638"/>
       </w:tblGrid>
       <w:tr>
-        <w:tblPrEx>
-          <w:tblCellMar>
-            <w:top w:w="0" w:type="dxa"/>
-            <w:bottom w:w="0" w:type="dxa"/>
-          </w:tblCellMar>
-        </w:tblPrEx>
         <w:trPr>
           <w:cantSplit/>
         </w:trPr>
@@ -8592,12 +8290,6 @@
         <w:gridCol w:w="9638"/>
       </w:tblGrid>
       <w:tr>
-        <w:tblPrEx>
-          <w:tblCellMar>
-            <w:top w:w="0" w:type="dxa"/>
-            <w:bottom w:w="0" w:type="dxa"/>
-          </w:tblCellMar>
-        </w:tblPrEx>
         <w:trPr>
           <w:cantSplit/>
         </w:trPr>
@@ -8797,12 +8489,6 @@
         <w:gridCol w:w="5038"/>
       </w:tblGrid>
       <w:tr>
-        <w:tblPrEx>
-          <w:tblCellMar>
-            <w:top w:w="0" w:type="dxa"/>
-            <w:bottom w:w="0" w:type="dxa"/>
-          </w:tblCellMar>
-        </w:tblPrEx>
         <w:trPr>
           <w:tblHeader/>
         </w:trPr>
@@ -8870,12 +8556,6 @@
         </w:tc>
       </w:tr>
       <w:tr>
-        <w:tblPrEx>
-          <w:tblCellMar>
-            <w:top w:w="0" w:type="dxa"/>
-            <w:bottom w:w="0" w:type="dxa"/>
-          </w:tblCellMar>
-        </w:tblPrEx>
         <w:tc>
           <w:tcPr>
             <w:tcW w:w="4600" w:type="dxa"/>
@@ -8978,12 +8658,6 @@
         </w:tc>
       </w:tr>
       <w:tr>
-        <w:tblPrEx>
-          <w:tblCellMar>
-            <w:top w:w="0" w:type="dxa"/>
-            <w:bottom w:w="0" w:type="dxa"/>
-          </w:tblCellMar>
-        </w:tblPrEx>
         <w:tc>
           <w:tcPr>
             <w:tcW w:w="4600" w:type="dxa"/>
@@ -9095,12 +8769,6 @@
         </w:tc>
       </w:tr>
       <w:tr>
-        <w:tblPrEx>
-          <w:tblCellMar>
-            <w:top w:w="0" w:type="dxa"/>
-            <w:bottom w:w="0" w:type="dxa"/>
-          </w:tblCellMar>
-        </w:tblPrEx>
         <w:tc>
           <w:tcPr>
             <w:tcW w:w="4600" w:type="dxa"/>
@@ -9187,12 +8855,6 @@
         <w:gridCol w:w="9638"/>
       </w:tblGrid>
       <w:tr>
-        <w:tblPrEx>
-          <w:tblCellMar>
-            <w:top w:w="0" w:type="dxa"/>
-            <w:bottom w:w="0" w:type="dxa"/>
-          </w:tblCellMar>
-        </w:tblPrEx>
         <w:trPr>
           <w:cantSplit/>
         </w:trPr>
@@ -9381,12 +9043,6 @@
         <w:gridCol w:w="9638"/>
       </w:tblGrid>
       <w:tr>
-        <w:tblPrEx>
-          <w:tblCellMar>
-            <w:top w:w="0" w:type="dxa"/>
-            <w:bottom w:w="0" w:type="dxa"/>
-          </w:tblCellMar>
-        </w:tblPrEx>
         <w:trPr>
           <w:cantSplit/>
         </w:trPr>
@@ -9503,12 +9159,6 @@
         <w:gridCol w:w="9638"/>
       </w:tblGrid>
       <w:tr>
-        <w:tblPrEx>
-          <w:tblCellMar>
-            <w:top w:w="0" w:type="dxa"/>
-            <w:bottom w:w="0" w:type="dxa"/>
-          </w:tblCellMar>
-        </w:tblPrEx>
         <w:trPr>
           <w:cantSplit/>
         </w:trPr>
@@ -9827,12 +9477,6 @@
         <w:gridCol w:w="3638"/>
       </w:tblGrid>
       <w:tr>
-        <w:tblPrEx>
-          <w:tblCellMar>
-            <w:top w:w="0" w:type="dxa"/>
-            <w:bottom w:w="0" w:type="dxa"/>
-          </w:tblCellMar>
-        </w:tblPrEx>
         <w:trPr>
           <w:tblHeader/>
         </w:trPr>
@@ -9931,12 +9575,6 @@
         </w:tc>
       </w:tr>
       <w:tr>
-        <w:tblPrEx>
-          <w:tblCellMar>
-            <w:top w:w="0" w:type="dxa"/>
-            <w:bottom w:w="0" w:type="dxa"/>
-          </w:tblCellMar>
-        </w:tblPrEx>
         <w:tc>
           <w:tcPr>
             <w:tcW w:w="2600" w:type="dxa"/>
@@ -10026,12 +9664,6 @@
         </w:tc>
       </w:tr>
       <w:tr>
-        <w:tblPrEx>
-          <w:tblCellMar>
-            <w:top w:w="0" w:type="dxa"/>
-            <w:bottom w:w="0" w:type="dxa"/>
-          </w:tblCellMar>
-        </w:tblPrEx>
         <w:tc>
           <w:tcPr>
             <w:tcW w:w="2600" w:type="dxa"/>
@@ -10165,12 +9797,6 @@
         <w:gridCol w:w="9638"/>
       </w:tblGrid>
       <w:tr>
-        <w:tblPrEx>
-          <w:tblCellMar>
-            <w:top w:w="0" w:type="dxa"/>
-            <w:bottom w:w="0" w:type="dxa"/>
-          </w:tblCellMar>
-        </w:tblPrEx>
         <w:trPr>
           <w:cantSplit/>
         </w:trPr>
@@ -10382,12 +10008,6 @@
         <w:gridCol w:w="9638"/>
       </w:tblGrid>
       <w:tr>
-        <w:tblPrEx>
-          <w:tblCellMar>
-            <w:top w:w="0" w:type="dxa"/>
-            <w:bottom w:w="0" w:type="dxa"/>
-          </w:tblCellMar>
-        </w:tblPrEx>
         <w:trPr>
           <w:cantSplit/>
         </w:trPr>
@@ -10492,12 +10112,6 @@
         <w:gridCol w:w="9638"/>
       </w:tblGrid>
       <w:tr>
-        <w:tblPrEx>
-          <w:tblCellMar>
-            <w:top w:w="0" w:type="dxa"/>
-            <w:bottom w:w="0" w:type="dxa"/>
-          </w:tblCellMar>
-        </w:tblPrEx>
         <w:trPr>
           <w:cantSplit/>
         </w:trPr>
@@ -10866,12 +10480,6 @@
         <w:gridCol w:w="9638"/>
       </w:tblGrid>
       <w:tr>
-        <w:tblPrEx>
-          <w:tblCellMar>
-            <w:top w:w="0" w:type="dxa"/>
-            <w:bottom w:w="0" w:type="dxa"/>
-          </w:tblCellMar>
-        </w:tblPrEx>
         <w:trPr>
           <w:cantSplit/>
         </w:trPr>
@@ -11009,12 +10617,6 @@
         <w:gridCol w:w="9638"/>
       </w:tblGrid>
       <w:tr>
-        <w:tblPrEx>
-          <w:tblCellMar>
-            <w:top w:w="0" w:type="dxa"/>
-            <w:bottom w:w="0" w:type="dxa"/>
-          </w:tblCellMar>
-        </w:tblPrEx>
         <w:trPr>
           <w:cantSplit/>
         </w:trPr>
@@ -11291,12 +10893,6 @@
         <w:gridCol w:w="5838"/>
       </w:tblGrid>
       <w:tr>
-        <w:tblPrEx>
-          <w:tblCellMar>
-            <w:top w:w="0" w:type="dxa"/>
-            <w:bottom w:w="0" w:type="dxa"/>
-          </w:tblCellMar>
-        </w:tblPrEx>
         <w:trPr>
           <w:tblHeader/>
         </w:trPr>
@@ -11364,12 +10960,6 @@
         </w:tc>
       </w:tr>
       <w:tr>
-        <w:tblPrEx>
-          <w:tblCellMar>
-            <w:top w:w="0" w:type="dxa"/>
-            <w:bottom w:w="0" w:type="dxa"/>
-          </w:tblCellMar>
-        </w:tblPrEx>
         <w:tc>
           <w:tcPr>
             <w:tcW w:w="3800" w:type="dxa"/>
@@ -11442,12 +11032,6 @@
         </w:tc>
       </w:tr>
       <w:tr>
-        <w:tblPrEx>
-          <w:tblCellMar>
-            <w:top w:w="0" w:type="dxa"/>
-            <w:bottom w:w="0" w:type="dxa"/>
-          </w:tblCellMar>
-        </w:tblPrEx>
         <w:tc>
           <w:tcPr>
             <w:tcW w:w="3800" w:type="dxa"/>
@@ -11508,12 +11092,6 @@
         </w:tc>
       </w:tr>
       <w:tr>
-        <w:tblPrEx>
-          <w:tblCellMar>
-            <w:top w:w="0" w:type="dxa"/>
-            <w:bottom w:w="0" w:type="dxa"/>
-          </w:tblCellMar>
-        </w:tblPrEx>
         <w:tc>
           <w:tcPr>
             <w:tcW w:w="3800" w:type="dxa"/>
@@ -11635,12 +11213,6 @@
         </w:tc>
       </w:tr>
       <w:tr>
-        <w:tblPrEx>
-          <w:tblCellMar>
-            <w:top w:w="0" w:type="dxa"/>
-            <w:bottom w:w="0" w:type="dxa"/>
-          </w:tblCellMar>
-        </w:tblPrEx>
         <w:tc>
           <w:tcPr>
             <w:tcW w:w="3800" w:type="dxa"/>
@@ -11732,12 +11304,6 @@
         </w:tc>
       </w:tr>
       <w:tr>
-        <w:tblPrEx>
-          <w:tblCellMar>
-            <w:top w:w="0" w:type="dxa"/>
-            <w:bottom w:w="0" w:type="dxa"/>
-          </w:tblCellMar>
-        </w:tblPrEx>
         <w:tc>
           <w:tcPr>
             <w:tcW w:w="3800" w:type="dxa"/>
@@ -11868,12 +11434,6 @@
         <w:gridCol w:w="9638"/>
       </w:tblGrid>
       <w:tr>
-        <w:tblPrEx>
-          <w:tblCellMar>
-            <w:top w:w="0" w:type="dxa"/>
-            <w:bottom w:w="0" w:type="dxa"/>
-          </w:tblCellMar>
-        </w:tblPrEx>
         <w:trPr>
           <w:cantSplit/>
         </w:trPr>
@@ -12096,12 +11656,6 @@
         <w:gridCol w:w="9638"/>
       </w:tblGrid>
       <w:tr>
-        <w:tblPrEx>
-          <w:tblCellMar>
-            <w:top w:w="0" w:type="dxa"/>
-            <w:bottom w:w="0" w:type="dxa"/>
-          </w:tblCellMar>
-        </w:tblPrEx>
         <w:trPr>
           <w:cantSplit/>
         </w:trPr>
@@ -12203,12 +11757,6 @@
         <w:gridCol w:w="9638"/>
       </w:tblGrid>
       <w:tr>
-        <w:tblPrEx>
-          <w:tblCellMar>
-            <w:top w:w="0" w:type="dxa"/>
-            <w:bottom w:w="0" w:type="dxa"/>
-          </w:tblCellMar>
-        </w:tblPrEx>
         <w:trPr>
           <w:cantSplit/>
         </w:trPr>
@@ -12340,12 +11888,6 @@
         <w:gridCol w:w="3838"/>
       </w:tblGrid>
       <w:tr>
-        <w:tblPrEx>
-          <w:tblCellMar>
-            <w:top w:w="0" w:type="dxa"/>
-            <w:bottom w:w="0" w:type="dxa"/>
-          </w:tblCellMar>
-        </w:tblPrEx>
         <w:trPr>
           <w:tblHeader/>
         </w:trPr>
@@ -12475,12 +12017,6 @@
         </w:tc>
       </w:tr>
       <w:tr>
-        <w:tblPrEx>
-          <w:tblCellMar>
-            <w:top w:w="0" w:type="dxa"/>
-            <w:bottom w:w="0" w:type="dxa"/>
-          </w:tblCellMar>
-        </w:tblPrEx>
         <w:tc>
           <w:tcPr>
             <w:tcW w:w="1100" w:type="dxa"/>
@@ -12603,12 +12139,6 @@
         </w:tc>
       </w:tr>
       <w:tr>
-        <w:tblPrEx>
-          <w:tblCellMar>
-            <w:top w:w="0" w:type="dxa"/>
-            <w:bottom w:w="0" w:type="dxa"/>
-          </w:tblCellMar>
-        </w:tblPrEx>
         <w:tc>
           <w:tcPr>
             <w:tcW w:w="1100" w:type="dxa"/>
@@ -12757,12 +12287,6 @@
         <w:gridCol w:w="9638"/>
       </w:tblGrid>
       <w:tr>
-        <w:tblPrEx>
-          <w:tblCellMar>
-            <w:top w:w="0" w:type="dxa"/>
-            <w:bottom w:w="0" w:type="dxa"/>
-          </w:tblCellMar>
-        </w:tblPrEx>
         <w:trPr>
           <w:cantSplit/>
         </w:trPr>
@@ -12938,12 +12462,6 @@
         <w:gridCol w:w="9638"/>
       </w:tblGrid>
       <w:tr>
-        <w:tblPrEx>
-          <w:tblCellMar>
-            <w:top w:w="0" w:type="dxa"/>
-            <w:bottom w:w="0" w:type="dxa"/>
-          </w:tblCellMar>
-        </w:tblPrEx>
         <w:trPr>
           <w:cantSplit/>
         </w:trPr>
@@ -13559,12 +13077,6 @@
         <w:gridCol w:w="9638"/>
       </w:tblGrid>
       <w:tr>
-        <w:tblPrEx>
-          <w:tblCellMar>
-            <w:top w:w="0" w:type="dxa"/>
-            <w:bottom w:w="0" w:type="dxa"/>
-          </w:tblCellMar>
-        </w:tblPrEx>
         <w:trPr>
           <w:cantSplit/>
         </w:trPr>
@@ -13787,12 +13299,6 @@
         <w:gridCol w:w="9638"/>
       </w:tblGrid>
       <w:tr>
-        <w:tblPrEx>
-          <w:tblCellMar>
-            <w:top w:w="0" w:type="dxa"/>
-            <w:bottom w:w="0" w:type="dxa"/>
-          </w:tblCellMar>
-        </w:tblPrEx>
         <w:trPr>
           <w:cantSplit/>
         </w:trPr>
@@ -13903,12 +13409,6 @@
         <w:gridCol w:w="3438"/>
       </w:tblGrid>
       <w:tr>
-        <w:tblPrEx>
-          <w:tblCellMar>
-            <w:top w:w="0" w:type="dxa"/>
-            <w:bottom w:w="0" w:type="dxa"/>
-          </w:tblCellMar>
-        </w:tblPrEx>
         <w:trPr>
           <w:tblHeader/>
         </w:trPr>
@@ -14038,12 +13538,6 @@
         </w:tc>
       </w:tr>
       <w:tr>
-        <w:tblPrEx>
-          <w:tblCellMar>
-            <w:top w:w="0" w:type="dxa"/>
-            <w:bottom w:w="0" w:type="dxa"/>
-          </w:tblCellMar>
-        </w:tblPrEx>
         <w:tc>
           <w:tcPr>
             <w:tcW w:w="500" w:type="dxa"/>
@@ -14168,12 +13662,6 @@
         </w:tc>
       </w:tr>
       <w:tr>
-        <w:tblPrEx>
-          <w:tblCellMar>
-            <w:top w:w="0" w:type="dxa"/>
-            <w:bottom w:w="0" w:type="dxa"/>
-          </w:tblCellMar>
-        </w:tblPrEx>
         <w:tc>
           <w:tcPr>
             <w:tcW w:w="500" w:type="dxa"/>
@@ -14306,12 +13794,6 @@
         </w:tc>
       </w:tr>
       <w:tr>
-        <w:tblPrEx>
-          <w:tblCellMar>
-            <w:top w:w="0" w:type="dxa"/>
-            <w:bottom w:w="0" w:type="dxa"/>
-          </w:tblCellMar>
-        </w:tblPrEx>
         <w:tc>
           <w:tcPr>
             <w:tcW w:w="500" w:type="dxa"/>
@@ -14435,12 +13917,6 @@
         </w:tc>
       </w:tr>
       <w:tr>
-        <w:tblPrEx>
-          <w:tblCellMar>
-            <w:top w:w="0" w:type="dxa"/>
-            <w:bottom w:w="0" w:type="dxa"/>
-          </w:tblCellMar>
-        </w:tblPrEx>
         <w:tc>
           <w:tcPr>
             <w:tcW w:w="500" w:type="dxa"/>
@@ -14553,12 +14029,6 @@
         </w:tc>
       </w:tr>
       <w:tr>
-        <w:tblPrEx>
-          <w:tblCellMar>
-            <w:top w:w="0" w:type="dxa"/>
-            <w:bottom w:w="0" w:type="dxa"/>
-          </w:tblCellMar>
-        </w:tblPrEx>
         <w:tc>
           <w:tcPr>
             <w:tcW w:w="500" w:type="dxa"/>
@@ -14720,12 +14190,6 @@
         </w:tc>
       </w:tr>
       <w:tr>
-        <w:tblPrEx>
-          <w:tblCellMar>
-            <w:top w:w="0" w:type="dxa"/>
-            <w:bottom w:w="0" w:type="dxa"/>
-          </w:tblCellMar>
-        </w:tblPrEx>
         <w:tc>
           <w:tcPr>
             <w:tcW w:w="500" w:type="dxa"/>
@@ -14852,12 +14316,6 @@
         </w:tc>
       </w:tr>
       <w:tr>
-        <w:tblPrEx>
-          <w:tblCellMar>
-            <w:top w:w="0" w:type="dxa"/>
-            <w:bottom w:w="0" w:type="dxa"/>
-          </w:tblCellMar>
-        </w:tblPrEx>
         <w:tc>
           <w:tcPr>
             <w:tcW w:w="500" w:type="dxa"/>
@@ -15081,12 +14539,6 @@
         <w:gridCol w:w="9638"/>
       </w:tblGrid>
       <w:tr>
-        <w:tblPrEx>
-          <w:tblCellMar>
-            <w:top w:w="0" w:type="dxa"/>
-            <w:bottom w:w="0" w:type="dxa"/>
-          </w:tblCellMar>
-        </w:tblPrEx>
         <w:trPr>
           <w:cantSplit/>
         </w:trPr>
@@ -15594,12 +15046,6 @@
         <w:gridCol w:w="3738"/>
       </w:tblGrid>
       <w:tr>
-        <w:tblPrEx>
-          <w:tblCellMar>
-            <w:top w:w="0" w:type="dxa"/>
-            <w:bottom w:w="0" w:type="dxa"/>
-          </w:tblCellMar>
-        </w:tblPrEx>
         <w:trPr>
           <w:tblHeader/>
         </w:trPr>
@@ -15699,12 +15145,6 @@
         </w:tc>
       </w:tr>
       <w:tr>
-        <w:tblPrEx>
-          <w:tblCellMar>
-            <w:top w:w="0" w:type="dxa"/>
-            <w:bottom w:w="0" w:type="dxa"/>
-          </w:tblCellMar>
-        </w:tblPrEx>
         <w:tc>
           <w:tcPr>
             <w:tcW w:w="4000" w:type="dxa"/>
@@ -15791,12 +15231,6 @@
         </w:tc>
       </w:tr>
       <w:tr>
-        <w:tblPrEx>
-          <w:tblCellMar>
-            <w:top w:w="0" w:type="dxa"/>
-            <w:bottom w:w="0" w:type="dxa"/>
-          </w:tblCellMar>
-        </w:tblPrEx>
         <w:tc>
           <w:tcPr>
             <w:tcW w:w="4000" w:type="dxa"/>
@@ -15894,12 +15328,6 @@
         </w:tc>
       </w:tr>
       <w:tr>
-        <w:tblPrEx>
-          <w:tblCellMar>
-            <w:top w:w="0" w:type="dxa"/>
-            <w:bottom w:w="0" w:type="dxa"/>
-          </w:tblCellMar>
-        </w:tblPrEx>
         <w:tc>
           <w:tcPr>
             <w:tcW w:w="4000" w:type="dxa"/>
@@ -15986,12 +15414,6 @@
         </w:tc>
       </w:tr>
       <w:tr>
-        <w:tblPrEx>
-          <w:tblCellMar>
-            <w:top w:w="0" w:type="dxa"/>
-            <w:bottom w:w="0" w:type="dxa"/>
-          </w:tblCellMar>
-        </w:tblPrEx>
         <w:tc>
           <w:tcPr>
             <w:tcW w:w="4000" w:type="dxa"/>
@@ -16118,12 +15540,6 @@
         </w:tc>
       </w:tr>
       <w:tr>
-        <w:tblPrEx>
-          <w:tblCellMar>
-            <w:top w:w="0" w:type="dxa"/>
-            <w:bottom w:w="0" w:type="dxa"/>
-          </w:tblCellMar>
-        </w:tblPrEx>
         <w:tc>
           <w:tcPr>
             <w:tcW w:w="4000" w:type="dxa"/>
@@ -16210,12 +15626,6 @@
         </w:tc>
       </w:tr>
       <w:tr>
-        <w:tblPrEx>
-          <w:tblCellMar>
-            <w:top w:w="0" w:type="dxa"/>
-            <w:bottom w:w="0" w:type="dxa"/>
-          </w:tblCellMar>
-        </w:tblPrEx>
         <w:tc>
           <w:tcPr>
             <w:tcW w:w="4000" w:type="dxa"/>
@@ -16342,12 +15752,6 @@
         </w:tc>
       </w:tr>
       <w:tr>
-        <w:tblPrEx>
-          <w:tblCellMar>
-            <w:top w:w="0" w:type="dxa"/>
-            <w:bottom w:w="0" w:type="dxa"/>
-          </w:tblCellMar>
-        </w:tblPrEx>
         <w:tc>
           <w:tcPr>
             <w:tcW w:w="4000" w:type="dxa"/>
@@ -16454,12 +15858,6 @@
         </w:tc>
       </w:tr>
       <w:tr>
-        <w:tblPrEx>
-          <w:tblCellMar>
-            <w:top w:w="0" w:type="dxa"/>
-            <w:bottom w:w="0" w:type="dxa"/>
-          </w:tblCellMar>
-        </w:tblPrEx>
         <w:tc>
           <w:tcPr>
             <w:tcW w:w="4000" w:type="dxa"/>
@@ -16546,12 +15944,6 @@
         </w:tc>
       </w:tr>
       <w:tr>
-        <w:tblPrEx>
-          <w:tblCellMar>
-            <w:top w:w="0" w:type="dxa"/>
-            <w:bottom w:w="0" w:type="dxa"/>
-          </w:tblCellMar>
-        </w:tblPrEx>
         <w:tc>
           <w:tcPr>
             <w:tcW w:w="4000" w:type="dxa"/>
@@ -16709,12 +16101,6 @@
         <w:gridCol w:w="9638"/>
       </w:tblGrid>
       <w:tr>
-        <w:tblPrEx>
-          <w:tblCellMar>
-            <w:top w:w="0" w:type="dxa"/>
-            <w:bottom w:w="0" w:type="dxa"/>
-          </w:tblCellMar>
-        </w:tblPrEx>
         <w:trPr>
           <w:cantSplit/>
         </w:trPr>
@@ -17168,12 +16554,6 @@
         <w:gridCol w:w="9638"/>
       </w:tblGrid>
       <w:tr>
-        <w:tblPrEx>
-          <w:tblCellMar>
-            <w:top w:w="0" w:type="dxa"/>
-            <w:bottom w:w="0" w:type="dxa"/>
-          </w:tblCellMar>
-        </w:tblPrEx>
         <w:trPr>
           <w:cantSplit/>
         </w:trPr>
@@ -17270,12 +16650,6 @@
         <w:gridCol w:w="9638"/>
       </w:tblGrid>
       <w:tr>
-        <w:tblPrEx>
-          <w:tblCellMar>
-            <w:top w:w="0" w:type="dxa"/>
-            <w:bottom w:w="0" w:type="dxa"/>
-          </w:tblCellMar>
-        </w:tblPrEx>
         <w:trPr>
           <w:cantSplit/>
         </w:trPr>
@@ -17387,12 +16761,6 @@
         <w:gridCol w:w="9638"/>
       </w:tblGrid>
       <w:tr>
-        <w:tblPrEx>
-          <w:tblCellMar>
-            <w:top w:w="0" w:type="dxa"/>
-            <w:bottom w:w="0" w:type="dxa"/>
-          </w:tblCellMar>
-        </w:tblPrEx>
         <w:trPr>
           <w:cantSplit/>
         </w:trPr>
@@ -17475,12 +16843,6 @@
         <w:gridCol w:w="9638"/>
       </w:tblGrid>
       <w:tr>
-        <w:tblPrEx>
-          <w:tblCellMar>
-            <w:top w:w="0" w:type="dxa"/>
-            <w:bottom w:w="0" w:type="dxa"/>
-          </w:tblCellMar>
-        </w:tblPrEx>
         <w:trPr>
           <w:cantSplit/>
         </w:trPr>
@@ -17547,12 +16909,6 @@
               <w:gridCol w:w="5438"/>
             </w:tblGrid>
             <w:tr>
-              <w:tblPrEx>
-                <w:tblCellMar>
-                  <w:top w:w="0" w:type="dxa"/>
-                  <w:bottom w:w="0" w:type="dxa"/>
-                </w:tblCellMar>
-              </w:tblPrEx>
               <w:trPr>
                 <w:tblHeader/>
               </w:trPr>
@@ -17620,12 +16976,6 @@
               </w:tc>
             </w:tr>
             <w:tr>
-              <w:tblPrEx>
-                <w:tblCellMar>
-                  <w:top w:w="0" w:type="dxa"/>
-                  <w:bottom w:w="0" w:type="dxa"/>
-                </w:tblCellMar>
-              </w:tblPrEx>
               <w:tc>
                 <w:tcPr>
                   <w:tcW w:w="3600" w:type="dxa"/>
@@ -17713,12 +17063,6 @@
               </w:tc>
             </w:tr>
             <w:tr>
-              <w:tblPrEx>
-                <w:tblCellMar>
-                  <w:top w:w="0" w:type="dxa"/>
-                  <w:bottom w:w="0" w:type="dxa"/>
-                </w:tblCellMar>
-              </w:tblPrEx>
               <w:tc>
                 <w:tcPr>
                   <w:tcW w:w="3600" w:type="dxa"/>
@@ -17794,12 +17138,6 @@
               </w:tc>
             </w:tr>
             <w:tr>
-              <w:tblPrEx>
-                <w:tblCellMar>
-                  <w:top w:w="0" w:type="dxa"/>
-                  <w:bottom w:w="0" w:type="dxa"/>
-                </w:tblCellMar>
-              </w:tblPrEx>
               <w:tc>
                 <w:tcPr>
                   <w:tcW w:w="3600" w:type="dxa"/>
@@ -17973,12 +17311,6 @@
         <w:gridCol w:w="9638"/>
       </w:tblGrid>
       <w:tr>
-        <w:tblPrEx>
-          <w:tblCellMar>
-            <w:top w:w="0" w:type="dxa"/>
-            <w:bottom w:w="0" w:type="dxa"/>
-          </w:tblCellMar>
-        </w:tblPrEx>
         <w:trPr>
           <w:cantSplit/>
         </w:trPr>
@@ -18443,12 +17775,6 @@
         <w:gridCol w:w="9638"/>
       </w:tblGrid>
       <w:tr>
-        <w:tblPrEx>
-          <w:tblCellMar>
-            <w:top w:w="0" w:type="dxa"/>
-            <w:bottom w:w="0" w:type="dxa"/>
-          </w:tblCellMar>
-        </w:tblPrEx>
         <w:trPr>
           <w:cantSplit/>
         </w:trPr>
@@ -18719,12 +18045,6 @@
         <w:gridCol w:w="9638"/>
       </w:tblGrid>
       <w:tr>
-        <w:tblPrEx>
-          <w:tblCellMar>
-            <w:top w:w="0" w:type="dxa"/>
-            <w:bottom w:w="0" w:type="dxa"/>
-          </w:tblCellMar>
-        </w:tblPrEx>
         <w:trPr>
           <w:cantSplit/>
         </w:trPr>
@@ -18840,12 +18160,6 @@
         <w:gridCol w:w="5638"/>
       </w:tblGrid>
       <w:tr>
-        <w:tblPrEx>
-          <w:tblCellMar>
-            <w:top w:w="0" w:type="dxa"/>
-            <w:bottom w:w="0" w:type="dxa"/>
-          </w:tblCellMar>
-        </w:tblPrEx>
         <w:trPr>
           <w:tblHeader/>
         </w:trPr>
@@ -18913,12 +18227,6 @@
         </w:tc>
       </w:tr>
       <w:tr>
-        <w:tblPrEx>
-          <w:tblCellMar>
-            <w:top w:w="0" w:type="dxa"/>
-            <w:bottom w:w="0" w:type="dxa"/>
-          </w:tblCellMar>
-        </w:tblPrEx>
         <w:tc>
           <w:tcPr>
             <w:tcW w:w="4000" w:type="dxa"/>
@@ -19003,12 +18311,6 @@
         </w:tc>
       </w:tr>
       <w:tr>
-        <w:tblPrEx>
-          <w:tblCellMar>
-            <w:top w:w="0" w:type="dxa"/>
-            <w:bottom w:w="0" w:type="dxa"/>
-          </w:tblCellMar>
-        </w:tblPrEx>
         <w:tc>
           <w:tcPr>
             <w:tcW w:w="4000" w:type="dxa"/>
@@ -19089,12 +18391,6 @@
         </w:tc>
       </w:tr>
       <w:tr>
-        <w:tblPrEx>
-          <w:tblCellMar>
-            <w:top w:w="0" w:type="dxa"/>
-            <w:bottom w:w="0" w:type="dxa"/>
-          </w:tblCellMar>
-        </w:tblPrEx>
         <w:tc>
           <w:tcPr>
             <w:tcW w:w="4000" w:type="dxa"/>
@@ -19167,12 +18463,6 @@
         </w:tc>
       </w:tr>
       <w:tr>
-        <w:tblPrEx>
-          <w:tblCellMar>
-            <w:top w:w="0" w:type="dxa"/>
-            <w:bottom w:w="0" w:type="dxa"/>
-          </w:tblCellMar>
-        </w:tblPrEx>
         <w:tc>
           <w:tcPr>
             <w:tcW w:w="4000" w:type="dxa"/>
@@ -19255,12 +18545,6 @@
         </w:tc>
       </w:tr>
       <w:tr>
-        <w:tblPrEx>
-          <w:tblCellMar>
-            <w:top w:w="0" w:type="dxa"/>
-            <w:bottom w:w="0" w:type="dxa"/>
-          </w:tblCellMar>
-        </w:tblPrEx>
         <w:tc>
           <w:tcPr>
             <w:tcW w:w="4000" w:type="dxa"/>
@@ -19348,12 +18632,6 @@
         <w:gridCol w:w="9638"/>
       </w:tblGrid>
       <w:tr>
-        <w:tblPrEx>
-          <w:tblCellMar>
-            <w:top w:w="0" w:type="dxa"/>
-            <w:bottom w:w="0" w:type="dxa"/>
-          </w:tblCellMar>
-        </w:tblPrEx>
         <w:trPr>
           <w:cantSplit/>
         </w:trPr>
@@ -19436,12 +18714,6 @@
         <w:gridCol w:w="9638"/>
       </w:tblGrid>
       <w:tr>
-        <w:tblPrEx>
-          <w:tblCellMar>
-            <w:top w:w="0" w:type="dxa"/>
-            <w:bottom w:w="0" w:type="dxa"/>
-          </w:tblCellMar>
-        </w:tblPrEx>
         <w:trPr>
           <w:cantSplit/>
         </w:trPr>
@@ -19643,12 +18915,6 @@
         <w:gridCol w:w="9638"/>
       </w:tblGrid>
       <w:tr>
-        <w:tblPrEx>
-          <w:tblCellMar>
-            <w:top w:w="0" w:type="dxa"/>
-            <w:bottom w:w="0" w:type="dxa"/>
-          </w:tblCellMar>
-        </w:tblPrEx>
         <w:trPr>
           <w:cantSplit/>
         </w:trPr>
@@ -19871,12 +19137,6 @@
         <w:gridCol w:w="9638"/>
       </w:tblGrid>
       <w:tr>
-        <w:tblPrEx>
-          <w:tblCellMar>
-            <w:top w:w="0" w:type="dxa"/>
-            <w:bottom w:w="0" w:type="dxa"/>
-          </w:tblCellMar>
-        </w:tblPrEx>
         <w:trPr>
           <w:cantSplit/>
         </w:trPr>
@@ -20027,12 +19287,6 @@
         <w:gridCol w:w="9638"/>
       </w:tblGrid>
       <w:tr>
-        <w:tblPrEx>
-          <w:tblCellMar>
-            <w:top w:w="0" w:type="dxa"/>
-            <w:bottom w:w="0" w:type="dxa"/>
-          </w:tblCellMar>
-        </w:tblPrEx>
         <w:trPr>
           <w:cantSplit/>
         </w:trPr>
@@ -20161,12 +19415,6 @@
         <w:gridCol w:w="9638"/>
       </w:tblGrid>
       <w:tr>
-        <w:tblPrEx>
-          <w:tblCellMar>
-            <w:top w:w="0" w:type="dxa"/>
-            <w:bottom w:w="0" w:type="dxa"/>
-          </w:tblCellMar>
-        </w:tblPrEx>
         <w:trPr>
           <w:cantSplit/>
         </w:trPr>
@@ -20325,12 +19573,6 @@
         <w:gridCol w:w="9638"/>
       </w:tblGrid>
       <w:tr>
-        <w:tblPrEx>
-          <w:tblCellMar>
-            <w:top w:w="0" w:type="dxa"/>
-            <w:bottom w:w="0" w:type="dxa"/>
-          </w:tblCellMar>
-        </w:tblPrEx>
         <w:trPr>
           <w:cantSplit/>
         </w:trPr>
@@ -20457,12 +19699,6 @@
         <w:gridCol w:w="6038"/>
       </w:tblGrid>
       <w:tr>
-        <w:tblPrEx>
-          <w:tblCellMar>
-            <w:top w:w="0" w:type="dxa"/>
-            <w:bottom w:w="0" w:type="dxa"/>
-          </w:tblCellMar>
-        </w:tblPrEx>
         <w:trPr>
           <w:tblHeader/>
         </w:trPr>
@@ -20530,12 +19766,6 @@
         </w:tc>
       </w:tr>
       <w:tr>
-        <w:tblPrEx>
-          <w:tblCellMar>
-            <w:top w:w="0" w:type="dxa"/>
-            <w:bottom w:w="0" w:type="dxa"/>
-          </w:tblCellMar>
-        </w:tblPrEx>
         <w:tc>
           <w:tcPr>
             <w:tcW w:w="3600" w:type="dxa"/>
@@ -20618,12 +19848,6 @@
         </w:tc>
       </w:tr>
       <w:tr>
-        <w:tblPrEx>
-          <w:tblCellMar>
-            <w:top w:w="0" w:type="dxa"/>
-            <w:bottom w:w="0" w:type="dxa"/>
-          </w:tblCellMar>
-        </w:tblPrEx>
         <w:tc>
           <w:tcPr>
             <w:tcW w:w="3600" w:type="dxa"/>
@@ -20746,12 +19970,6 @@
         <w:gridCol w:w="9638"/>
       </w:tblGrid>
       <w:tr>
-        <w:tblPrEx>
-          <w:tblCellMar>
-            <w:top w:w="0" w:type="dxa"/>
-            <w:bottom w:w="0" w:type="dxa"/>
-          </w:tblCellMar>
-        </w:tblPrEx>
         <w:trPr>
           <w:cantSplit/>
         </w:trPr>
@@ -20957,12 +20175,6 @@
         <w:gridCol w:w="9638"/>
       </w:tblGrid>
       <w:tr>
-        <w:tblPrEx>
-          <w:tblCellMar>
-            <w:top w:w="0" w:type="dxa"/>
-            <w:bottom w:w="0" w:type="dxa"/>
-          </w:tblCellMar>
-        </w:tblPrEx>
         <w:trPr>
           <w:cantSplit/>
         </w:trPr>
@@ -21099,12 +20311,6 @@
         <w:gridCol w:w="9638"/>
       </w:tblGrid>
       <w:tr>
-        <w:tblPrEx>
-          <w:tblCellMar>
-            <w:top w:w="0" w:type="dxa"/>
-            <w:bottom w:w="0" w:type="dxa"/>
-          </w:tblCellMar>
-        </w:tblPrEx>
         <w:trPr>
           <w:cantSplit/>
         </w:trPr>
@@ -21254,12 +20460,6 @@
         <w:gridCol w:w="6638"/>
       </w:tblGrid>
       <w:tr>
-        <w:tblPrEx>
-          <w:tblCellMar>
-            <w:top w:w="0" w:type="dxa"/>
-            <w:bottom w:w="0" w:type="dxa"/>
-          </w:tblCellMar>
-        </w:tblPrEx>
         <w:trPr>
           <w:tblHeader/>
         </w:trPr>
@@ -21337,12 +20537,6 @@
         </w:tc>
       </w:tr>
       <w:tr>
-        <w:tblPrEx>
-          <w:tblCellMar>
-            <w:top w:w="0" w:type="dxa"/>
-            <w:bottom w:w="0" w:type="dxa"/>
-          </w:tblCellMar>
-        </w:tblPrEx>
         <w:tc>
           <w:tcPr>
             <w:tcW w:w="3000" w:type="dxa"/>
@@ -21403,12 +20597,6 @@
         </w:tc>
       </w:tr>
       <w:tr>
-        <w:tblPrEx>
-          <w:tblCellMar>
-            <w:top w:w="0" w:type="dxa"/>
-            <w:bottom w:w="0" w:type="dxa"/>
-          </w:tblCellMar>
-        </w:tblPrEx>
         <w:tc>
           <w:tcPr>
             <w:tcW w:w="3000" w:type="dxa"/>
@@ -21469,12 +20657,6 @@
         </w:tc>
       </w:tr>
       <w:tr>
-        <w:tblPrEx>
-          <w:tblCellMar>
-            <w:top w:w="0" w:type="dxa"/>
-            <w:bottom w:w="0" w:type="dxa"/>
-          </w:tblCellMar>
-        </w:tblPrEx>
         <w:tc>
           <w:tcPr>
             <w:tcW w:w="3000" w:type="dxa"/>
@@ -21535,12 +20717,6 @@
         </w:tc>
       </w:tr>
       <w:tr>
-        <w:tblPrEx>
-          <w:tblCellMar>
-            <w:top w:w="0" w:type="dxa"/>
-            <w:bottom w:w="0" w:type="dxa"/>
-          </w:tblCellMar>
-        </w:tblPrEx>
         <w:tc>
           <w:tcPr>
             <w:tcW w:w="3000" w:type="dxa"/>
@@ -21612,12 +20788,6 @@
         </w:tc>
       </w:tr>
       <w:tr>
-        <w:tblPrEx>
-          <w:tblCellMar>
-            <w:top w:w="0" w:type="dxa"/>
-            <w:bottom w:w="0" w:type="dxa"/>
-          </w:tblCellMar>
-        </w:tblPrEx>
         <w:tc>
           <w:tcPr>
             <w:tcW w:w="3000" w:type="dxa"/>
@@ -21744,12 +20914,6 @@
         <w:gridCol w:w="9638"/>
       </w:tblGrid>
       <w:tr>
-        <w:tblPrEx>
-          <w:tblCellMar>
-            <w:top w:w="0" w:type="dxa"/>
-            <w:bottom w:w="0" w:type="dxa"/>
-          </w:tblCellMar>
-        </w:tblPrEx>
         <w:trPr>
           <w:cantSplit/>
         </w:trPr>
@@ -21879,12 +21043,6 @@
         <w:gridCol w:w="9638"/>
       </w:tblGrid>
       <w:tr>
-        <w:tblPrEx>
-          <w:tblCellMar>
-            <w:top w:w="0" w:type="dxa"/>
-            <w:bottom w:w="0" w:type="dxa"/>
-          </w:tblCellMar>
-        </w:tblPrEx>
         <w:trPr>
           <w:cantSplit/>
         </w:trPr>
@@ -22012,12 +21170,6 @@
         <w:gridCol w:w="9638"/>
       </w:tblGrid>
       <w:tr>
-        <w:tblPrEx>
-          <w:tblCellMar>
-            <w:top w:w="0" w:type="dxa"/>
-            <w:bottom w:w="0" w:type="dxa"/>
-          </w:tblCellMar>
-        </w:tblPrEx>
         <w:trPr>
           <w:cantSplit/>
         </w:trPr>
@@ -22129,12 +21281,6 @@
         <w:gridCol w:w="4938"/>
       </w:tblGrid>
       <w:tr>
-        <w:tblPrEx>
-          <w:tblCellMar>
-            <w:top w:w="0" w:type="dxa"/>
-            <w:bottom w:w="0" w:type="dxa"/>
-          </w:tblCellMar>
-        </w:tblPrEx>
         <w:trPr>
           <w:tblHeader/>
         </w:trPr>
@@ -22233,12 +21379,6 @@
         </w:tc>
       </w:tr>
       <w:tr>
-        <w:tblPrEx>
-          <w:tblCellMar>
-            <w:top w:w="0" w:type="dxa"/>
-            <w:bottom w:w="0" w:type="dxa"/>
-          </w:tblCellMar>
-        </w:tblPrEx>
         <w:tc>
           <w:tcPr>
             <w:tcW w:w="1500" w:type="dxa"/>
@@ -22330,12 +21470,6 @@
         </w:tc>
       </w:tr>
       <w:tr>
-        <w:tblPrEx>
-          <w:tblCellMar>
-            <w:top w:w="0" w:type="dxa"/>
-            <w:bottom w:w="0" w:type="dxa"/>
-          </w:tblCellMar>
-        </w:tblPrEx>
         <w:tc>
           <w:tcPr>
             <w:tcW w:w="1500" w:type="dxa"/>
@@ -22420,12 +21554,6 @@
         </w:tc>
       </w:tr>
       <w:tr>
-        <w:tblPrEx>
-          <w:tblCellMar>
-            <w:top w:w="0" w:type="dxa"/>
-            <w:bottom w:w="0" w:type="dxa"/>
-          </w:tblCellMar>
-        </w:tblPrEx>
         <w:tc>
           <w:tcPr>
             <w:tcW w:w="1500" w:type="dxa"/>
@@ -22510,12 +21638,6 @@
         </w:tc>
       </w:tr>
       <w:tr>
-        <w:tblPrEx>
-          <w:tblCellMar>
-            <w:top w:w="0" w:type="dxa"/>
-            <w:bottom w:w="0" w:type="dxa"/>
-          </w:tblCellMar>
-        </w:tblPrEx>
         <w:tc>
           <w:tcPr>
             <w:tcW w:w="1500" w:type="dxa"/>
@@ -22633,12 +21755,6 @@
         <w:gridCol w:w="9638"/>
       </w:tblGrid>
       <w:tr>
-        <w:tblPrEx>
-          <w:tblCellMar>
-            <w:top w:w="0" w:type="dxa"/>
-            <w:bottom w:w="0" w:type="dxa"/>
-          </w:tblCellMar>
-        </w:tblPrEx>
         <w:trPr>
           <w:cantSplit/>
         </w:trPr>
@@ -22722,12 +21838,6 @@
               <w:gridCol w:w="6038"/>
             </w:tblGrid>
             <w:tr>
-              <w:tblPrEx>
-                <w:tblCellMar>
-                  <w:top w:w="0" w:type="dxa"/>
-                  <w:bottom w:w="0" w:type="dxa"/>
-                </w:tblCellMar>
-              </w:tblPrEx>
               <w:trPr>
                 <w:tblHeader/>
               </w:trPr>
@@ -22813,12 +21923,6 @@
               </w:tc>
             </w:tr>
             <w:tr>
-              <w:tblPrEx>
-                <w:tblCellMar>
-                  <w:top w:w="0" w:type="dxa"/>
-                  <w:bottom w:w="0" w:type="dxa"/>
-                </w:tblCellMar>
-              </w:tblPrEx>
               <w:tc>
                 <w:tcPr>
                   <w:tcW w:w="3000" w:type="dxa"/>
@@ -22921,12 +22025,6 @@
               </w:tc>
             </w:tr>
             <w:tr>
-              <w:tblPrEx>
-                <w:tblCellMar>
-                  <w:top w:w="0" w:type="dxa"/>
-                  <w:bottom w:w="0" w:type="dxa"/>
-                </w:tblCellMar>
-              </w:tblPrEx>
               <w:tc>
                 <w:tcPr>
                   <w:tcW w:w="3000" w:type="dxa"/>
@@ -23032,12 +22130,6 @@
         <w:gridCol w:w="9638"/>
       </w:tblGrid>
       <w:tr>
-        <w:tblPrEx>
-          <w:tblCellMar>
-            <w:top w:w="0" w:type="dxa"/>
-            <w:bottom w:w="0" w:type="dxa"/>
-          </w:tblCellMar>
-        </w:tblPrEx>
         <w:trPr>
           <w:cantSplit/>
         </w:trPr>
@@ -23174,12 +22266,6 @@
         <w:gridCol w:w="9638"/>
       </w:tblGrid>
       <w:tr>
-        <w:tblPrEx>
-          <w:tblCellMar>
-            <w:top w:w="0" w:type="dxa"/>
-            <w:bottom w:w="0" w:type="dxa"/>
-          </w:tblCellMar>
-        </w:tblPrEx>
         <w:trPr>
           <w:cantSplit/>
         </w:trPr>
@@ -23280,12 +22366,6 @@
         <w:gridCol w:w="9638"/>
       </w:tblGrid>
       <w:tr>
-        <w:tblPrEx>
-          <w:tblCellMar>
-            <w:top w:w="0" w:type="dxa"/>
-            <w:bottom w:w="0" w:type="dxa"/>
-          </w:tblCellMar>
-        </w:tblPrEx>
         <w:trPr>
           <w:cantSplit/>
         </w:trPr>
@@ -23440,12 +22520,6 @@
         <w:gridCol w:w="9638"/>
       </w:tblGrid>
       <w:tr>
-        <w:tblPrEx>
-          <w:tblCellMar>
-            <w:top w:w="0" w:type="dxa"/>
-            <w:bottom w:w="0" w:type="dxa"/>
-          </w:tblCellMar>
-        </w:tblPrEx>
         <w:trPr>
           <w:cantSplit/>
         </w:trPr>
@@ -23592,12 +22666,6 @@
         <w:gridCol w:w="9638"/>
       </w:tblGrid>
       <w:tr>
-        <w:tblPrEx>
-          <w:tblCellMar>
-            <w:top w:w="0" w:type="dxa"/>
-            <w:bottom w:w="0" w:type="dxa"/>
-          </w:tblCellMar>
-        </w:tblPrEx>
         <w:trPr>
           <w:cantSplit/>
         </w:trPr>
@@ -23780,12 +22848,6 @@
         <w:gridCol w:w="9638"/>
       </w:tblGrid>
       <w:tr>
-        <w:tblPrEx>
-          <w:tblCellMar>
-            <w:top w:w="0" w:type="dxa"/>
-            <w:bottom w:w="0" w:type="dxa"/>
-          </w:tblCellMar>
-        </w:tblPrEx>
         <w:trPr>
           <w:cantSplit/>
         </w:trPr>
@@ -24171,12 +23233,6 @@
         <w:gridCol w:w="9638"/>
       </w:tblGrid>
       <w:tr>
-        <w:tblPrEx>
-          <w:tblCellMar>
-            <w:top w:w="0" w:type="dxa"/>
-            <w:bottom w:w="0" w:type="dxa"/>
-          </w:tblCellMar>
-        </w:tblPrEx>
         <w:trPr>
           <w:cantSplit/>
         </w:trPr>
@@ -24345,12 +23401,6 @@
         <w:gridCol w:w="9638"/>
       </w:tblGrid>
       <w:tr>
-        <w:tblPrEx>
-          <w:tblCellMar>
-            <w:top w:w="0" w:type="dxa"/>
-            <w:bottom w:w="0" w:type="dxa"/>
-          </w:tblCellMar>
-        </w:tblPrEx>
         <w:trPr>
           <w:cantSplit/>
         </w:trPr>
@@ -24453,12 +23503,6 @@
         <w:gridCol w:w="9638"/>
       </w:tblGrid>
       <w:tr>
-        <w:tblPrEx>
-          <w:tblCellMar>
-            <w:top w:w="0" w:type="dxa"/>
-            <w:bottom w:w="0" w:type="dxa"/>
-          </w:tblCellMar>
-        </w:tblPrEx>
         <w:trPr>
           <w:cantSplit/>
         </w:trPr>
@@ -24580,12 +23624,6 @@
         <w:gridCol w:w="9638"/>
       </w:tblGrid>
       <w:tr>
-        <w:tblPrEx>
-          <w:tblCellMar>
-            <w:top w:w="0" w:type="dxa"/>
-            <w:bottom w:w="0" w:type="dxa"/>
-          </w:tblCellMar>
-        </w:tblPrEx>
         <w:trPr>
           <w:cantSplit/>
         </w:trPr>
@@ -24763,12 +23801,6 @@
         <w:gridCol w:w="9638"/>
       </w:tblGrid>
       <w:tr>
-        <w:tblPrEx>
-          <w:tblCellMar>
-            <w:top w:w="0" w:type="dxa"/>
-            <w:bottom w:w="0" w:type="dxa"/>
-          </w:tblCellMar>
-        </w:tblPrEx>
         <w:trPr>
           <w:cantSplit/>
         </w:trPr>
@@ -25092,12 +24124,6 @@
         <w:gridCol w:w="9638"/>
       </w:tblGrid>
       <w:tr>
-        <w:tblPrEx>
-          <w:tblCellMar>
-            <w:top w:w="0" w:type="dxa"/>
-            <w:bottom w:w="0" w:type="dxa"/>
-          </w:tblCellMar>
-        </w:tblPrEx>
         <w:trPr>
           <w:cantSplit/>
         </w:trPr>
@@ -25190,12 +24216,6 @@
         <w:gridCol w:w="9638"/>
       </w:tblGrid>
       <w:tr>
-        <w:tblPrEx>
-          <w:tblCellMar>
-            <w:top w:w="0" w:type="dxa"/>
-            <w:bottom w:w="0" w:type="dxa"/>
-          </w:tblCellMar>
-        </w:tblPrEx>
         <w:trPr>
           <w:cantSplit/>
         </w:trPr>
@@ -25458,12 +24478,6 @@
         <w:gridCol w:w="6438"/>
       </w:tblGrid>
       <w:tr>
-        <w:tblPrEx>
-          <w:tblCellMar>
-            <w:top w:w="0" w:type="dxa"/>
-            <w:bottom w:w="0" w:type="dxa"/>
-          </w:tblCellMar>
-        </w:tblPrEx>
         <w:trPr>
           <w:tblHeader/>
         </w:trPr>
@@ -25531,12 +24545,6 @@
         </w:tc>
       </w:tr>
       <w:tr>
-        <w:tblPrEx>
-          <w:tblCellMar>
-            <w:top w:w="0" w:type="dxa"/>
-            <w:bottom w:w="0" w:type="dxa"/>
-          </w:tblCellMar>
-        </w:tblPrEx>
         <w:tc>
           <w:tcPr>
             <w:tcW w:w="3200" w:type="dxa"/>
@@ -25623,12 +24631,6 @@
         </w:tc>
       </w:tr>
       <w:tr>
-        <w:tblPrEx>
-          <w:tblCellMar>
-            <w:top w:w="0" w:type="dxa"/>
-            <w:bottom w:w="0" w:type="dxa"/>
-          </w:tblCellMar>
-        </w:tblPrEx>
         <w:tc>
           <w:tcPr>
             <w:tcW w:w="3200" w:type="dxa"/>
@@ -25696,12 +24698,6 @@
         </w:tc>
       </w:tr>
       <w:tr>
-        <w:tblPrEx>
-          <w:tblCellMar>
-            <w:top w:w="0" w:type="dxa"/>
-            <w:bottom w:w="0" w:type="dxa"/>
-          </w:tblCellMar>
-        </w:tblPrEx>
         <w:tc>
           <w:tcPr>
             <w:tcW w:w="3200" w:type="dxa"/>
@@ -25790,12 +24786,6 @@
         </w:tc>
       </w:tr>
       <w:tr>
-        <w:tblPrEx>
-          <w:tblCellMar>
-            <w:top w:w="0" w:type="dxa"/>
-            <w:bottom w:w="0" w:type="dxa"/>
-          </w:tblCellMar>
-        </w:tblPrEx>
         <w:tc>
           <w:tcPr>
             <w:tcW w:w="3200" w:type="dxa"/>
@@ -26003,12 +24993,6 @@
         <w:gridCol w:w="9638"/>
       </w:tblGrid>
       <w:tr>
-        <w:tblPrEx>
-          <w:tblCellMar>
-            <w:top w:w="0" w:type="dxa"/>
-            <w:bottom w:w="0" w:type="dxa"/>
-          </w:tblCellMar>
-        </w:tblPrEx>
         <w:trPr>
           <w:cantSplit/>
         </w:trPr>
@@ -26135,12 +25119,6 @@
         <w:gridCol w:w="2438"/>
       </w:tblGrid>
       <w:tr>
-        <w:tblPrEx>
-          <w:tblCellMar>
-            <w:top w:w="0" w:type="dxa"/>
-            <w:bottom w:w="0" w:type="dxa"/>
-          </w:tblCellMar>
-        </w:tblPrEx>
         <w:trPr>
           <w:tblHeader/>
         </w:trPr>
@@ -26274,12 +25252,6 @@
         </w:tc>
       </w:tr>
       <w:tr>
-        <w:tblPrEx>
-          <w:tblCellMar>
-            <w:top w:w="0" w:type="dxa"/>
-            <w:bottom w:w="0" w:type="dxa"/>
-          </w:tblCellMar>
-        </w:tblPrEx>
         <w:tc>
           <w:tcPr>
             <w:tcW w:w="2400" w:type="dxa"/>
@@ -26394,12 +25366,6 @@
         </w:tc>
       </w:tr>
       <w:tr>
-        <w:tblPrEx>
-          <w:tblCellMar>
-            <w:top w:w="0" w:type="dxa"/>
-            <w:bottom w:w="0" w:type="dxa"/>
-          </w:tblCellMar>
-        </w:tblPrEx>
         <w:tc>
           <w:tcPr>
             <w:tcW w:w="2400" w:type="dxa"/>
@@ -26513,12 +25479,6 @@
         </w:tc>
       </w:tr>
       <w:tr>
-        <w:tblPrEx>
-          <w:tblCellMar>
-            <w:top w:w="0" w:type="dxa"/>
-            <w:bottom w:w="0" w:type="dxa"/>
-          </w:tblCellMar>
-        </w:tblPrEx>
         <w:tc>
           <w:tcPr>
             <w:tcW w:w="2400" w:type="dxa"/>
@@ -26637,12 +25597,6 @@
         </w:tc>
       </w:tr>
       <w:tr>
-        <w:tblPrEx>
-          <w:tblCellMar>
-            <w:top w:w="0" w:type="dxa"/>
-            <w:bottom w:w="0" w:type="dxa"/>
-          </w:tblCellMar>
-        </w:tblPrEx>
         <w:tc>
           <w:tcPr>
             <w:tcW w:w="2400" w:type="dxa"/>
@@ -26782,12 +25736,6 @@
         <w:gridCol w:w="9638"/>
       </w:tblGrid>
       <w:tr>
-        <w:tblPrEx>
-          <w:tblCellMar>
-            <w:top w:w="0" w:type="dxa"/>
-            <w:bottom w:w="0" w:type="dxa"/>
-          </w:tblCellMar>
-        </w:tblPrEx>
         <w:trPr>
           <w:cantSplit/>
         </w:trPr>
@@ -26916,12 +25864,6 @@
         <w:gridCol w:w="3538"/>
       </w:tblGrid>
       <w:tr>
-        <w:tblPrEx>
-          <w:tblCellMar>
-            <w:top w:w="0" w:type="dxa"/>
-            <w:bottom w:w="0" w:type="dxa"/>
-          </w:tblCellMar>
-        </w:tblPrEx>
         <w:trPr>
           <w:tblHeader/>
         </w:trPr>
@@ -27022,12 +25964,6 @@
         </w:tc>
       </w:tr>
       <w:tr>
-        <w:tblPrEx>
-          <w:tblCellMar>
-            <w:top w:w="0" w:type="dxa"/>
-            <w:bottom w:w="0" w:type="dxa"/>
-          </w:tblCellMar>
-        </w:tblPrEx>
         <w:tc>
           <w:tcPr>
             <w:tcW w:w="2600" w:type="dxa"/>
@@ -27112,12 +26048,6 @@
         </w:tc>
       </w:tr>
       <w:tr>
-        <w:tblPrEx>
-          <w:tblCellMar>
-            <w:top w:w="0" w:type="dxa"/>
-            <w:bottom w:w="0" w:type="dxa"/>
-          </w:tblCellMar>
-        </w:tblPrEx>
         <w:tc>
           <w:tcPr>
             <w:tcW w:w="2600" w:type="dxa"/>
@@ -27202,12 +26132,6 @@
         </w:tc>
       </w:tr>
       <w:tr>
-        <w:tblPrEx>
-          <w:tblCellMar>
-            <w:top w:w="0" w:type="dxa"/>
-            <w:bottom w:w="0" w:type="dxa"/>
-          </w:tblCellMar>
-        </w:tblPrEx>
         <w:tc>
           <w:tcPr>
             <w:tcW w:w="2600" w:type="dxa"/>
@@ -27292,12 +26216,6 @@
         </w:tc>
       </w:tr>
       <w:tr>
-        <w:tblPrEx>
-          <w:tblCellMar>
-            <w:top w:w="0" w:type="dxa"/>
-            <w:bottom w:w="0" w:type="dxa"/>
-          </w:tblCellMar>
-        </w:tblPrEx>
         <w:tc>
           <w:tcPr>
             <w:tcW w:w="2600" w:type="dxa"/>
@@ -27382,12 +26300,6 @@
         </w:tc>
       </w:tr>
       <w:tr>
-        <w:tblPrEx>
-          <w:tblCellMar>
-            <w:top w:w="0" w:type="dxa"/>
-            <w:bottom w:w="0" w:type="dxa"/>
-          </w:tblCellMar>
-        </w:tblPrEx>
         <w:tc>
           <w:tcPr>
             <w:tcW w:w="2600" w:type="dxa"/>
@@ -27520,12 +26432,6 @@
         <w:gridCol w:w="9638"/>
       </w:tblGrid>
       <w:tr>
-        <w:tblPrEx>
-          <w:tblCellMar>
-            <w:top w:w="0" w:type="dxa"/>
-            <w:bottom w:w="0" w:type="dxa"/>
-          </w:tblCellMar>
-        </w:tblPrEx>
         <w:trPr>
           <w:cantSplit/>
         </w:trPr>
@@ -27620,12 +26526,6 @@
         <w:gridCol w:w="9638"/>
       </w:tblGrid>
       <w:tr>
-        <w:tblPrEx>
-          <w:tblCellMar>
-            <w:top w:w="0" w:type="dxa"/>
-            <w:bottom w:w="0" w:type="dxa"/>
-          </w:tblCellMar>
-        </w:tblPrEx>
         <w:trPr>
           <w:cantSplit/>
         </w:trPr>
@@ -27764,12 +26664,6 @@
         <w:gridCol w:w="9638"/>
       </w:tblGrid>
       <w:tr>
-        <w:tblPrEx>
-          <w:tblCellMar>
-            <w:top w:w="0" w:type="dxa"/>
-            <w:bottom w:w="0" w:type="dxa"/>
-          </w:tblCellMar>
-        </w:tblPrEx>
         <w:trPr>
           <w:cantSplit/>
         </w:trPr>
@@ -28183,12 +27077,6 @@
         <w:gridCol w:w="9638"/>
       </w:tblGrid>
       <w:tr>
-        <w:tblPrEx>
-          <w:tblCellMar>
-            <w:top w:w="0" w:type="dxa"/>
-            <w:bottom w:w="0" w:type="dxa"/>
-          </w:tblCellMar>
-        </w:tblPrEx>
         <w:trPr>
           <w:cantSplit/>
         </w:trPr>
@@ -28621,12 +27509,6 @@
         <w:gridCol w:w="9638"/>
       </w:tblGrid>
       <w:tr>
-        <w:tblPrEx>
-          <w:tblCellMar>
-            <w:top w:w="0" w:type="dxa"/>
-            <w:bottom w:w="0" w:type="dxa"/>
-          </w:tblCellMar>
-        </w:tblPrEx>
         <w:trPr>
           <w:cantSplit/>
         </w:trPr>
@@ -29316,12 +28198,6 @@
         <w:gridCol w:w="9638"/>
       </w:tblGrid>
       <w:tr>
-        <w:tblPrEx>
-          <w:tblCellMar>
-            <w:top w:w="0" w:type="dxa"/>
-            <w:bottom w:w="0" w:type="dxa"/>
-          </w:tblCellMar>
-        </w:tblPrEx>
         <w:trPr>
           <w:cantSplit/>
         </w:trPr>
@@ -29434,12 +28310,6 @@
         <w:gridCol w:w="9638"/>
       </w:tblGrid>
       <w:tr>
-        <w:tblPrEx>
-          <w:tblCellMar>
-            <w:top w:w="0" w:type="dxa"/>
-            <w:bottom w:w="0" w:type="dxa"/>
-          </w:tblCellMar>
-        </w:tblPrEx>
         <w:trPr>
           <w:cantSplit/>
         </w:trPr>
@@ -29931,12 +28801,6 @@
         <w:gridCol w:w="5438"/>
       </w:tblGrid>
       <w:tr>
-        <w:tblPrEx>
-          <w:tblCellMar>
-            <w:top w:w="0" w:type="dxa"/>
-            <w:bottom w:w="0" w:type="dxa"/>
-          </w:tblCellMar>
-        </w:tblPrEx>
         <w:trPr>
           <w:tblHeader/>
         </w:trPr>
@@ -30004,12 +28868,6 @@
         </w:tc>
       </w:tr>
       <w:tr>
-        <w:tblPrEx>
-          <w:tblCellMar>
-            <w:top w:w="0" w:type="dxa"/>
-            <w:bottom w:w="0" w:type="dxa"/>
-          </w:tblCellMar>
-        </w:tblPrEx>
         <w:tc>
           <w:tcPr>
             <w:tcW w:w="4200" w:type="dxa"/>
@@ -30069,12 +28927,6 @@
         </w:tc>
       </w:tr>
       <w:tr>
-        <w:tblPrEx>
-          <w:tblCellMar>
-            <w:top w:w="0" w:type="dxa"/>
-            <w:bottom w:w="0" w:type="dxa"/>
-          </w:tblCellMar>
-        </w:tblPrEx>
         <w:tc>
           <w:tcPr>
             <w:tcW w:w="4200" w:type="dxa"/>
@@ -30149,12 +29001,6 @@
         </w:tc>
       </w:tr>
       <w:tr>
-        <w:tblPrEx>
-          <w:tblCellMar>
-            <w:top w:w="0" w:type="dxa"/>
-            <w:bottom w:w="0" w:type="dxa"/>
-          </w:tblCellMar>
-        </w:tblPrEx>
         <w:tc>
           <w:tcPr>
             <w:tcW w:w="4200" w:type="dxa"/>
@@ -30218,12 +29064,6 @@
         </w:tc>
       </w:tr>
       <w:tr>
-        <w:tblPrEx>
-          <w:tblCellMar>
-            <w:top w:w="0" w:type="dxa"/>
-            <w:bottom w:w="0" w:type="dxa"/>
-          </w:tblCellMar>
-        </w:tblPrEx>
         <w:tc>
           <w:tcPr>
             <w:tcW w:w="4200" w:type="dxa"/>
@@ -30290,12 +29130,6 @@
         </w:tc>
       </w:tr>
       <w:tr>
-        <w:tblPrEx>
-          <w:tblCellMar>
-            <w:top w:w="0" w:type="dxa"/>
-            <w:bottom w:w="0" w:type="dxa"/>
-          </w:tblCellMar>
-        </w:tblPrEx>
         <w:tc>
           <w:tcPr>
             <w:tcW w:w="4200" w:type="dxa"/>
@@ -30364,12 +29198,6 @@
         </w:tc>
       </w:tr>
       <w:tr>
-        <w:tblPrEx>
-          <w:tblCellMar>
-            <w:top w:w="0" w:type="dxa"/>
-            <w:bottom w:w="0" w:type="dxa"/>
-          </w:tblCellMar>
-        </w:tblPrEx>
         <w:tc>
           <w:tcPr>
             <w:tcW w:w="4200" w:type="dxa"/>
@@ -30424,12 +29252,6 @@
         </w:tc>
       </w:tr>
       <w:tr>
-        <w:tblPrEx>
-          <w:tblCellMar>
-            <w:top w:w="0" w:type="dxa"/>
-            <w:bottom w:w="0" w:type="dxa"/>
-          </w:tblCellMar>
-        </w:tblPrEx>
         <w:tc>
           <w:tcPr>
             <w:tcW w:w="4200" w:type="dxa"/>
@@ -30617,12 +29439,6 @@
         <w:gridCol w:w="7038"/>
       </w:tblGrid>
       <w:tr>
-        <w:tblPrEx>
-          <w:tblCellMar>
-            <w:top w:w="0" w:type="dxa"/>
-            <w:bottom w:w="0" w:type="dxa"/>
-          </w:tblCellMar>
-        </w:tblPrEx>
         <w:trPr>
           <w:tblHeader/>
         </w:trPr>
@@ -30690,12 +29506,6 @@
         </w:tc>
       </w:tr>
       <w:tr>
-        <w:tblPrEx>
-          <w:tblCellMar>
-            <w:top w:w="0" w:type="dxa"/>
-            <w:bottom w:w="0" w:type="dxa"/>
-          </w:tblCellMar>
-        </w:tblPrEx>
         <w:tc>
           <w:tcPr>
             <w:tcW w:w="2600" w:type="dxa"/>
@@ -30754,12 +29564,6 @@
         </w:tc>
       </w:tr>
       <w:tr>
-        <w:tblPrEx>
-          <w:tblCellMar>
-            <w:top w:w="0" w:type="dxa"/>
-            <w:bottom w:w="0" w:type="dxa"/>
-          </w:tblCellMar>
-        </w:tblPrEx>
         <w:tc>
           <w:tcPr>
             <w:tcW w:w="2600" w:type="dxa"/>
@@ -30823,12 +29627,6 @@
         </w:tc>
       </w:tr>
       <w:tr>
-        <w:tblPrEx>
-          <w:tblCellMar>
-            <w:top w:w="0" w:type="dxa"/>
-            <w:bottom w:w="0" w:type="dxa"/>
-          </w:tblCellMar>
-        </w:tblPrEx>
         <w:tc>
           <w:tcPr>
             <w:tcW w:w="2600" w:type="dxa"/>
@@ -30892,12 +29690,6 @@
         </w:tc>
       </w:tr>
       <w:tr>
-        <w:tblPrEx>
-          <w:tblCellMar>
-            <w:top w:w="0" w:type="dxa"/>
-            <w:bottom w:w="0" w:type="dxa"/>
-          </w:tblCellMar>
-        </w:tblPrEx>
         <w:tc>
           <w:tcPr>
             <w:tcW w:w="2600" w:type="dxa"/>
@@ -30956,12 +29748,6 @@
         </w:tc>
       </w:tr>
       <w:tr>
-        <w:tblPrEx>
-          <w:tblCellMar>
-            <w:top w:w="0" w:type="dxa"/>
-            <w:bottom w:w="0" w:type="dxa"/>
-          </w:tblCellMar>
-        </w:tblPrEx>
         <w:tc>
           <w:tcPr>
             <w:tcW w:w="2600" w:type="dxa"/>
@@ -31025,12 +29811,6 @@
         </w:tc>
       </w:tr>
       <w:tr>
-        <w:tblPrEx>
-          <w:tblCellMar>
-            <w:top w:w="0" w:type="dxa"/>
-            <w:bottom w:w="0" w:type="dxa"/>
-          </w:tblCellMar>
-        </w:tblPrEx>
         <w:tc>
           <w:tcPr>
             <w:tcW w:w="2600" w:type="dxa"/>
@@ -31102,12 +29882,6 @@
         </w:tc>
       </w:tr>
       <w:tr>
-        <w:tblPrEx>
-          <w:tblCellMar>
-            <w:top w:w="0" w:type="dxa"/>
-            <w:bottom w:w="0" w:type="dxa"/>
-          </w:tblCellMar>
-        </w:tblPrEx>
         <w:tc>
           <w:tcPr>
             <w:tcW w:w="2600" w:type="dxa"/>
@@ -31171,12 +29945,6 @@
         </w:tc>
       </w:tr>
       <w:tr>
-        <w:tblPrEx>
-          <w:tblCellMar>
-            <w:top w:w="0" w:type="dxa"/>
-            <w:bottom w:w="0" w:type="dxa"/>
-          </w:tblCellMar>
-        </w:tblPrEx>
         <w:tc>
           <w:tcPr>
             <w:tcW w:w="2600" w:type="dxa"/>
@@ -31235,12 +30003,6 @@
         </w:tc>
       </w:tr>
       <w:tr>
-        <w:tblPrEx>
-          <w:tblCellMar>
-            <w:top w:w="0" w:type="dxa"/>
-            <w:bottom w:w="0" w:type="dxa"/>
-          </w:tblCellMar>
-        </w:tblPrEx>
         <w:tc>
           <w:tcPr>
             <w:tcW w:w="2600" w:type="dxa"/>
@@ -31299,12 +30061,6 @@
         </w:tc>
       </w:tr>
       <w:tr>
-        <w:tblPrEx>
-          <w:tblCellMar>
-            <w:top w:w="0" w:type="dxa"/>
-            <w:bottom w:w="0" w:type="dxa"/>
-          </w:tblCellMar>
-        </w:tblPrEx>
         <w:tc>
           <w:tcPr>
             <w:tcW w:w="2600" w:type="dxa"/>
@@ -31363,12 +30119,6 @@
         </w:tc>
       </w:tr>
       <w:tr>
-        <w:tblPrEx>
-          <w:tblCellMar>
-            <w:top w:w="0" w:type="dxa"/>
-            <w:bottom w:w="0" w:type="dxa"/>
-          </w:tblCellMar>
-        </w:tblPrEx>
         <w:tc>
           <w:tcPr>
             <w:tcW w:w="2600" w:type="dxa"/>
@@ -31435,12 +30185,6 @@
         </w:tc>
       </w:tr>
       <w:tr>
-        <w:tblPrEx>
-          <w:tblCellMar>
-            <w:top w:w="0" w:type="dxa"/>
-            <w:bottom w:w="0" w:type="dxa"/>
-          </w:tblCellMar>
-        </w:tblPrEx>
         <w:tc>
           <w:tcPr>
             <w:tcW w:w="2600" w:type="dxa"/>
@@ -31507,12 +30251,6 @@
         </w:tc>
       </w:tr>
       <w:tr>
-        <w:tblPrEx>
-          <w:tblCellMar>
-            <w:top w:w="0" w:type="dxa"/>
-            <w:bottom w:w="0" w:type="dxa"/>
-          </w:tblCellMar>
-        </w:tblPrEx>
         <w:tc>
           <w:tcPr>
             <w:tcW w:w="2600" w:type="dxa"/>
@@ -31571,12 +30309,6 @@
         </w:tc>
       </w:tr>
       <w:tr>
-        <w:tblPrEx>
-          <w:tblCellMar>
-            <w:top w:w="0" w:type="dxa"/>
-            <w:bottom w:w="0" w:type="dxa"/>
-          </w:tblCellMar>
-        </w:tblPrEx>
         <w:tc>
           <w:tcPr>
             <w:tcW w:w="2600" w:type="dxa"/>
@@ -31651,12 +30383,6 @@
         </w:tc>
       </w:tr>
       <w:tr>
-        <w:tblPrEx>
-          <w:tblCellMar>
-            <w:top w:w="0" w:type="dxa"/>
-            <w:bottom w:w="0" w:type="dxa"/>
-          </w:tblCellMar>
-        </w:tblPrEx>
         <w:tc>
           <w:tcPr>
             <w:tcW w:w="2600" w:type="dxa"/>
@@ -31715,12 +30441,6 @@
         </w:tc>
       </w:tr>
       <w:tr>
-        <w:tblPrEx>
-          <w:tblCellMar>
-            <w:top w:w="0" w:type="dxa"/>
-            <w:bottom w:w="0" w:type="dxa"/>
-          </w:tblCellMar>
-        </w:tblPrEx>
         <w:tc>
           <w:tcPr>
             <w:tcW w:w="2600" w:type="dxa"/>
@@ -31781,12 +30501,6 @@
         </w:tc>
       </w:tr>
       <w:tr>
-        <w:tblPrEx>
-          <w:tblCellMar>
-            <w:top w:w="0" w:type="dxa"/>
-            <w:bottom w:w="0" w:type="dxa"/>
-          </w:tblCellMar>
-        </w:tblPrEx>
         <w:tc>
           <w:tcPr>
             <w:tcW w:w="2600" w:type="dxa"/>
@@ -31845,12 +30559,6 @@
         </w:tc>
       </w:tr>
       <w:tr>
-        <w:tblPrEx>
-          <w:tblCellMar>
-            <w:top w:w="0" w:type="dxa"/>
-            <w:bottom w:w="0" w:type="dxa"/>
-          </w:tblCellMar>
-        </w:tblPrEx>
         <w:tc>
           <w:tcPr>
             <w:tcW w:w="2600" w:type="dxa"/>

</xml_diff>